<commit_message>
segundo_commit: correccion de diagrama y primeras clases
</commit_message>
<xml_diff>
--- a/Ude@Book/Informe Analisis Ude@Book.docx
+++ b/Ude@Book/Informe Analisis Ude@Book.docx
@@ -211,7 +211,23 @@
         <w:t xml:space="preserve">Sabemos </w:t>
       </w:r>
       <w:r>
-        <w:t>que Ude@Book busca representar una red social donde cada persona tiene un perfil, puede relacionarse con otros usuarios, compartir fotos mediante álbumes y comunicarse por mensajes. La red social  no necesita una interfaz gráfica ni almacenar las imágenes directamente: para mostrar una foto basta con presentar la ruta del archivo donde se encuentra guardada.</w:t>
+        <w:t xml:space="preserve">que </w:t>
+      </w:r>
+      <w:proofErr w:type="spellStart"/>
+      <w:r>
+        <w:t>Ude@Book</w:t>
+      </w:r>
+      <w:proofErr w:type="spellEnd"/>
+      <w:r>
+        <w:t xml:space="preserve"> busca representar una red social donde cada persona tiene un perfil, puede relacionarse con otros usuarios, compartir fotos mediante álbumes y comunicarse por mensajes. La red </w:t>
+      </w:r>
+      <w:proofErr w:type="gramStart"/>
+      <w:r>
+        <w:t>social  no</w:t>
+      </w:r>
+      <w:proofErr w:type="gramEnd"/>
+      <w:r>
+        <w:t xml:space="preserve"> necesita una interfaz gráfica ni almacenar las imágenes directamente: para mostrar una foto basta con presentar la ruta del archivo donde se encuentra guardada.</w:t>
       </w:r>
     </w:p>
     <w:p>
@@ -234,24 +250,53 @@
           <w:b/>
           <w:bCs/>
         </w:rPr>
-        <w:t>Nuestro diseño de codigo </w:t>
-      </w:r>
-    </w:p>
-    <w:p>
-      <w:r>
-        <w:t>Nuestro código es dividir el programa en clases con responsabilidad a cada clase. La clase UdeABook funciona como coordinadora general; Usuario mantiene la información y relaciones de una persona; Álbum agrupa fotos; Foto y Mensaje representan contenidos; Fecha centraliza el manejo de fechas; y Medidor Recursos registra las métricas de ejecución. Esta separación ayuda a no concentrar toda la lógica en una sola clase o en el menú principal. Es lo que tenemos más superficialmente </w:t>
-      </w:r>
-    </w:p>
-    <w:p>
-      <w:r>
+        <w:t xml:space="preserve">Nuestro diseño de </w:t>
+      </w:r>
+      <w:proofErr w:type="spellStart"/>
+      <w:r>
+        <w:rPr>
+          <w:b/>
+          <w:bCs/>
+        </w:rPr>
+        <w:t>codigo</w:t>
+      </w:r>
+      <w:proofErr w:type="spellEnd"/>
+      <w:r>
+        <w:rPr>
+          <w:b/>
+          <w:bCs/>
+        </w:rPr>
+        <w:t> </w:t>
+      </w:r>
+    </w:p>
+    <w:p>
+      <w:r>
+        <w:t xml:space="preserve">Nuestro código es dividir el programa en clases con responsabilidad a cada clase. La clase </w:t>
+      </w:r>
+      <w:proofErr w:type="spellStart"/>
+      <w:r>
+        <w:t>UdeABook</w:t>
+      </w:r>
+      <w:proofErr w:type="spellEnd"/>
+      <w:r>
+        <w:t xml:space="preserve"> funciona como coordinadora general; Usuario mantiene la información y relaciones de una persona; Álbum agrupa fotos; Foto y Mensaje representan contenidos; Fecha centraliza el manejo de fechas; y Medidor Recursos registra las métricas de ejecución. Esta separación ayuda a no concentrar toda la lógica en una sola clase o en el menú principal. Es lo que tenemos más superficialmente </w:t>
+      </w:r>
+    </w:p>
+    <w:p>
+      <w:pPr>
         <w:rPr>
           <w:noProof/>
         </w:rPr>
+      </w:pPr>
+      <w:r>
+        <w:rPr>
+          <w:noProof/>
+        </w:rPr>
         <w:drawing>
-          <wp:inline distT="0" distB="0" distL="0" distR="0" wp14:anchorId="2407606F" wp14:editId="5488AF53">
-            <wp:extent cx="5612130" cy="2234565"/>
-            <wp:effectExtent l="0" t="0" r="7620" b="0"/>
-            <wp:docPr id="409836407" name="Imagen 2"/>
+          <wp:inline distT="0" distB="0" distL="0" distR="0" wp14:anchorId="22B28D4D" wp14:editId="3FBF83CB">
+            <wp:extent cx="5612130" cy="2322195"/>
+            <wp:effectExtent l="0" t="0" r="7620" b="1905"/>
+            <wp:docPr id="48673865" name="Imagen 1"/>
             <wp:cNvGraphicFramePr>
               <a:graphicFrameLocks xmlns:a="http://schemas.openxmlformats.org/drawingml/2006/main" noChangeAspect="1"/>
             </wp:cNvGraphicFramePr>
@@ -259,7 +304,7 @@
               <a:graphicData uri="http://schemas.openxmlformats.org/drawingml/2006/picture">
                 <pic:pic xmlns:pic="http://schemas.openxmlformats.org/drawingml/2006/picture">
                   <pic:nvPicPr>
-                    <pic:cNvPr id="0" name="Picture 6"/>
+                    <pic:cNvPr id="0" name="Picture 1"/>
                     <pic:cNvPicPr>
                       <a:picLocks noChangeAspect="1" noChangeArrowheads="1"/>
                     </pic:cNvPicPr>
@@ -280,7 +325,7 @@
                   <pic:spPr bwMode="auto">
                     <a:xfrm>
                       <a:off x="0" y="0"/>
-                      <a:ext cx="5612130" cy="2234565"/>
+                      <a:ext cx="5612130" cy="2322195"/>
                     </a:xfrm>
                     <a:prstGeom prst="rect">
                       <a:avLst/>
@@ -297,20 +342,58 @@
         </w:drawing>
       </w:r>
     </w:p>
+    <w:p/>
     <w:p>
       <w:r>
         <w:t>El diagrama muestra las clases principales y sus asociaciones. Al ser una versión resumida, presenta sobre todo las relaciones; en el diagrama completo conviene detallar también los atributos y las operaciones públicas de cada clase, para que coincidan con lo que finalmente se implemente.</w:t>
       </w:r>
     </w:p>
     <w:p>
+      <w:proofErr w:type="spellStart"/>
       <w:r>
         <w:lastRenderedPageBreak/>
-        <w:t>UdeABook administra a muchos usuarios y se relaciona con un medidor de recursos para registrar las medidas  de las operaciones  el Usuario puede llegar a tener cero o muchos álbumes y cada uno de estos pertenecen a un único usuario cabe recalcar que un álbum puede contener también cero o muchas fotos cada foto pertenece a un solo album.</w:t>
-      </w:r>
-    </w:p>
-    <w:p>
-      <w:r>
-        <w:t>El Usuario el mismo puede presentar la amistad y las solicitudes y esto es importante para que el programa distinga las amistades confirmadas y las solicitudes que siguen pendientes, los usuarios pueden enviar y recibir mensajes  y estos mensajes deben tener un emisor, receptor y una fecha de envío. </w:t>
+        <w:t>UdeABook</w:t>
+      </w:r>
+      <w:proofErr w:type="spellEnd"/>
+      <w:r>
+        <w:t xml:space="preserve"> administra a muchos usuarios y se relaciona con un medidor de recursos para registrar las </w:t>
+      </w:r>
+      <w:proofErr w:type="gramStart"/>
+      <w:r>
+        <w:t>medidas  de</w:t>
+      </w:r>
+      <w:proofErr w:type="gramEnd"/>
+      <w:r>
+        <w:t xml:space="preserve"> las </w:t>
+      </w:r>
+      <w:proofErr w:type="gramStart"/>
+      <w:r>
+        <w:t>operaciones  el</w:t>
+      </w:r>
+      <w:proofErr w:type="gramEnd"/>
+      <w:r>
+        <w:t xml:space="preserve"> Usuario puede llegar a tener cero o muchos álbumes y cada uno de estos pertenecen a un único usuario cabe recalcar que un álbum puede contener también cero o muchas fotos cada foto pertenece a un solo </w:t>
+      </w:r>
+      <w:proofErr w:type="spellStart"/>
+      <w:r>
+        <w:t>album</w:t>
+      </w:r>
+      <w:proofErr w:type="spellEnd"/>
+      <w:r>
+        <w:t>.</w:t>
+      </w:r>
+    </w:p>
+    <w:p>
+      <w:r>
+        <w:t xml:space="preserve">El Usuario el mismo puede presentar la amistad y las solicitudes y esto es importante para que el programa distinga las amistades confirmadas y las solicitudes que siguen pendientes, los usuarios pueden enviar y recibir </w:t>
+      </w:r>
+      <w:proofErr w:type="gramStart"/>
+      <w:r>
+        <w:t>mensajes  y</w:t>
+      </w:r>
+      <w:proofErr w:type="gramEnd"/>
+      <w:r>
+        <w:t xml:space="preserve"> estos mensajes deben tener un emisor, receptor y una fecha de envío. </w:t>
       </w:r>
     </w:p>
     <w:p>
@@ -351,12 +434,28 @@
     <w:p>
       <w:r>
         <w:lastRenderedPageBreak/>
-        <w:t>Para poder visitar el perfil y poder recorrer álbumes primero se verifica que el perfil corresponde a un amigo. Luego se muestran solamente los álbumes públicos o configurados para amigos. Al escoger un álbum, el carrusel comienza en una foto y permite avanzar o retroceder circularmente: después de la última se vuelve a la primera, y antes de la primera se pasa a la última. La opción de like incrementa el contador si se da y lo decrementa si se quita, sin permitir que quede negativo.</w:t>
-      </w:r>
-    </w:p>
-    <w:p>
-      <w:r>
-        <w:t>Para saber qué usuarios pueden llegar a hacer conocidos se puede calcular cuántos amigos se puede tener en común una forma de representar las amistades una comparación de los amigos  y que si una posición indica que dos usuarios son amigos o no. se recorre los amigos de los dos y se verifica cuales también son amigos del usuario de la sugerencia.</w:t>
+        <w:t xml:space="preserve">Para poder visitar el perfil y poder recorrer álbumes primero se verifica que el perfil corresponde a un amigo. Luego se muestran solamente los álbumes públicos o configurados para amigos. Al escoger un álbum, el carrusel comienza en una foto y permite avanzar o retroceder circularmente: después de la última se vuelve a la primera, y antes de la primera se pasa a la última. La opción de </w:t>
+      </w:r>
+      <w:proofErr w:type="spellStart"/>
+      <w:r>
+        <w:t>like</w:t>
+      </w:r>
+      <w:proofErr w:type="spellEnd"/>
+      <w:r>
+        <w:t xml:space="preserve"> incrementa el contador si se da y lo decrementa si se quita, sin permitir que quede negativo.</w:t>
+      </w:r>
+    </w:p>
+    <w:p>
+      <w:r>
+        <w:t xml:space="preserve">Para saber qué usuarios pueden llegar a hacer conocidos se puede calcular cuántos amigos se puede tener en común una forma de representar las amistades una comparación de los </w:t>
+      </w:r>
+      <w:proofErr w:type="gramStart"/>
+      <w:r>
+        <w:t>amigos  y</w:t>
+      </w:r>
+      <w:proofErr w:type="gramEnd"/>
+      <w:r>
+        <w:t xml:space="preserve"> que si una posición indica que dos usuarios son amigos o no. se recorre los amigos de los dos y se verifica cuales también son amigos del usuario de la sugerencia.</w:t>
       </w:r>
     </w:p>
     <w:p/>
@@ -371,7 +470,39 @@
     </w:p>
     <w:p>
       <w:r>
-        <w:t>Para que la persona pueda enviar un mensaje, primero, se comprueba que el sea amigo el que recibe, que el texto no vaya a estar vacío y que no supere los 512 caracteres debemos saber que el nuevo mensaje se va a registrar como emisor, receptor, fecha, estado inicial no leído. Para que el usuario pueda leer mensajes nuevos  debemos recorrer los mensajes recibidos y que se muestren solamente los no leídos ordenados por la última fecha de envío y después mostrarselos para marcarlos como leídos los al abrirse. Si se tiene una fecha ya con eso podemos saber si se quiere buscar mensaje en especifico o en rango de fechas.</w:t>
+        <w:t xml:space="preserve">Para que la persona pueda enviar un mensaje, primero, se comprueba que </w:t>
+      </w:r>
+      <w:proofErr w:type="spellStart"/>
+      <w:r>
+        <w:t>el</w:t>
+      </w:r>
+      <w:proofErr w:type="spellEnd"/>
+      <w:r>
+        <w:t xml:space="preserve"> sea amigo el que recibe, que el texto no vaya a estar vacío y que no supere los 512 caracteres debemos saber que el nuevo mensaje se va a registrar como emisor, receptor, fecha, estado inicial no leído. Para que el usuario pueda leer mensajes </w:t>
+      </w:r>
+      <w:proofErr w:type="gramStart"/>
+      <w:r>
+        <w:t>nuevos  debemos</w:t>
+      </w:r>
+      <w:proofErr w:type="gramEnd"/>
+      <w:r>
+        <w:t xml:space="preserve"> recorrer los mensajes recibidos y que se muestren solamente los no leídos ordenados por la última fecha de envío y después </w:t>
+      </w:r>
+      <w:proofErr w:type="spellStart"/>
+      <w:r>
+        <w:t>mostrarselos</w:t>
+      </w:r>
+      <w:proofErr w:type="spellEnd"/>
+      <w:r>
+        <w:t xml:space="preserve"> para marcarlos como leídos los al abrirse. Si se tiene una fecha ya con eso podemos saber si se quiere buscar mensaje en </w:t>
+      </w:r>
+      <w:proofErr w:type="spellStart"/>
+      <w:r>
+        <w:t>especifico</w:t>
+      </w:r>
+      <w:proofErr w:type="spellEnd"/>
+      <w:r>
+        <w:t xml:space="preserve"> o en rango de fechas.</w:t>
       </w:r>
     </w:p>
     <w:p/>
@@ -381,57 +512,46 @@
           <w:b/>
           <w:bCs/>
         </w:rPr>
-        <w:t>¿Cómo sabremos cuantos recursos usa nuestro código?(Sebastian Muñoz)</w:t>
-      </w:r>
-    </w:p>
-    <w:p/>
-    <w:p>
-      <w:r>
-        <w:t>Pensamos que para saber el gasto de recursos debemos tener en cuenta que en cada recorrido que podamos hacer en un arreglo y se haga cada comparación repetida o que se llaman a variables auxiliares que formen parte de una operación deben tener una forma de registro  al finalizar esta operación el número obtenido se muestra y después calculamos la memoria utilizada por los objetos los arreglos dinámicos y datos auxiliares.  </w:t>
-      </w:r>
-    </w:p>
-    <w:p/>
-    <w:p>
+        <w:t xml:space="preserve">¿Cómo sabremos cuantos recursos usa nuestro </w:t>
+      </w:r>
+      <w:proofErr w:type="gramStart"/>
       <w:r>
         <w:rPr>
           <w:b/>
           <w:bCs/>
         </w:rPr>
-        <w:t>Como</w:t>
-      </w:r>
-      <w:r>
-        <w:t xml:space="preserve"> </w:t>
-      </w:r>
+        <w:t>código?(</w:t>
+      </w:r>
+      <w:proofErr w:type="spellStart"/>
+      <w:proofErr w:type="gramEnd"/>
       <w:r>
         <w:rPr>
           <w:b/>
           <w:bCs/>
         </w:rPr>
-        <w:t>implementaremos</w:t>
-      </w:r>
-      <w:r>
-        <w:t xml:space="preserve"> </w:t>
-      </w:r>
+        <w:t>Sebastian</w:t>
+      </w:r>
+      <w:proofErr w:type="spellEnd"/>
       <w:r>
         <w:rPr>
           <w:b/>
           <w:bCs/>
         </w:rPr>
-        <w:t>Eficiencia</w:t>
-      </w:r>
-      <w:r>
-        <w:t xml:space="preserve">     (Por Sebastian Muñoz)</w:t>
-      </w:r>
-    </w:p>
-    <w:p>
-      <w:r>
-        <w:t>Para este código debemos priorizar siempre y principalmente los arreglos dinámicos y debemos fortalecer las estructuras para conversar y tener un control del uso de memoria.Sabemos que el uso de herencia aun no la utilizamos entonces cada clase debe encargarse de sus propios datos y poder hacer operaciones. </w:t>
-      </w:r>
-    </w:p>
-    <w:p>
-      <w:r>
-        <w:lastRenderedPageBreak/>
-        <w:t>Se tiene en cuenta que en nuestro código la clase fecha centraliza la comparación cronológica para que no se repetían la misma lógica en mensajes y usuarios y en el uso de constructores se deben de hacer de una forma adecuada  cuando sea uno de copia que una clase pueda gestionar la memoria dinámica y el uso de getters y setters cuando sean necesarios.</w:t>
+        <w:t xml:space="preserve"> Muñoz)</w:t>
+      </w:r>
+    </w:p>
+    <w:p/>
+    <w:p>
+      <w:r>
+        <w:t xml:space="preserve">Pensamos que para saber el gasto de recursos debemos tener en cuenta que en cada recorrido que podamos hacer en un arreglo y se haga cada comparación repetida o que se llaman a variables auxiliares que formen parte de una operación deben tener una forma de </w:t>
+      </w:r>
+      <w:proofErr w:type="gramStart"/>
+      <w:r>
+        <w:t>registro  al</w:t>
+      </w:r>
+      <w:proofErr w:type="gramEnd"/>
+      <w:r>
+        <w:t xml:space="preserve"> finalizar esta operación el número obtenido se muestra y después calculamos la memoria utilizada por los objetos los arreglos dinámicos y datos auxiliares.  </w:t>
       </w:r>
     </w:p>
     <w:p/>
@@ -441,28 +561,246 @@
           <w:b/>
           <w:bCs/>
         </w:rPr>
-        <w:t>Aun por resolver(Juan Jose)</w:t>
-      </w:r>
-    </w:p>
-    <w:p>
-      <w:r>
-        <w:t>Aún estamos pensando en cómo vamos a hacer  la lectura y escritura de archivos, porque los mensajes pueden incluir espacios y tener hasta 512 caracteres, medir la memoria de objetos que contienen arreglos dinámicos y contabilizar iteraciones de llamadas auxiliares requiere definir un criterio común y aplicarlo en toda la solución de nuestro código(sabemos el uso de lectura y escritura sobre la implementación) pero con el uso de métodos de cin(cin.ignore, cin.getline entre otros). </w:t>
-      </w:r>
-    </w:p>
-    <w:p/>
-    <w:p>
+        <w:t>Como</w:t>
+      </w:r>
+      <w:r>
+        <w:t xml:space="preserve"> </w:t>
+      </w:r>
       <w:r>
         <w:rPr>
           <w:b/>
           <w:bCs/>
         </w:rPr>
-        <w:t>Trabajo para hacer(Juan Jose)</w:t>
+        <w:t>implementaremos</w:t>
+      </w:r>
+      <w:r>
+        <w:t xml:space="preserve"> </w:t>
+      </w:r>
+      <w:r>
+        <w:rPr>
+          <w:b/>
+          <w:bCs/>
+        </w:rPr>
+        <w:t>Eficiencia</w:t>
+      </w:r>
+      <w:r>
+        <w:t xml:space="preserve">  </w:t>
+      </w:r>
+      <w:proofErr w:type="gramStart"/>
+      <w:r>
+        <w:t xml:space="preserve">   (</w:t>
+      </w:r>
+      <w:proofErr w:type="gramEnd"/>
+      <w:r>
+        <w:t xml:space="preserve">Por </w:t>
+      </w:r>
+      <w:proofErr w:type="spellStart"/>
+      <w:r>
+        <w:t>Sebastian</w:t>
+      </w:r>
+      <w:proofErr w:type="spellEnd"/>
+      <w:r>
+        <w:t xml:space="preserve"> Muñoz)</w:t>
+      </w:r>
+    </w:p>
+    <w:p>
+      <w:r>
+        <w:t xml:space="preserve">Para este código debemos priorizar siempre y principalmente los arreglos dinámicos y debemos fortalecer las estructuras para conversar y tener un control del uso de </w:t>
+      </w:r>
+      <w:proofErr w:type="spellStart"/>
+      <w:proofErr w:type="gramStart"/>
+      <w:r>
+        <w:t>memoria.Sabemos</w:t>
+      </w:r>
+      <w:proofErr w:type="spellEnd"/>
+      <w:proofErr w:type="gramEnd"/>
+      <w:r>
+        <w:t xml:space="preserve"> que el uso de herencia aun no la utilizamos entonces cada clase debe encargarse de sus propios datos y poder hacer operaciones. </w:t>
+      </w:r>
+    </w:p>
+    <w:p>
+      <w:r>
+        <w:lastRenderedPageBreak/>
+        <w:t xml:space="preserve">Se tiene en cuenta que en nuestro código la clase fecha centraliza la comparación cronológica para que no se repetían la misma lógica en mensajes y usuarios y en el uso de constructores se deben de hacer de una forma </w:t>
+      </w:r>
+      <w:proofErr w:type="gramStart"/>
+      <w:r>
+        <w:t>adecuada  cuando</w:t>
+      </w:r>
+      <w:proofErr w:type="gramEnd"/>
+      <w:r>
+        <w:t xml:space="preserve"> sea uno de copia que una clase pueda gestionar la memoria dinámica y el uso de </w:t>
+      </w:r>
+      <w:proofErr w:type="spellStart"/>
+      <w:r>
+        <w:t>getters</w:t>
+      </w:r>
+      <w:proofErr w:type="spellEnd"/>
+      <w:r>
+        <w:t xml:space="preserve"> y </w:t>
+      </w:r>
+      <w:proofErr w:type="spellStart"/>
+      <w:r>
+        <w:t>setters</w:t>
+      </w:r>
+      <w:proofErr w:type="spellEnd"/>
+      <w:r>
+        <w:t xml:space="preserve"> cuando sean necesarios.</w:t>
       </w:r>
     </w:p>
     <w:p/>
     <w:p>
       <w:r>
-        <w:t>Ejecución de pasó pasó del informe de nuestro equipo de trabajo completando el diagrama de clases agregando sus correspondientes atributos y métodos. También debemos elegir un formato de almacenamiento y crear la carga inicial de usuarios y relaciones implementando las funciones principales por partes iniciar la sesión, amistades, visitas de perfiles, sugerencias y mensajes. Pensamos implementar una medición para las iteraciones y memorias para tener un uso eficiente del codigo. Y realizaremos pruebas con 1000 usuarios para revisar los resultados. </w:t>
+        <w:rPr>
+          <w:b/>
+          <w:bCs/>
+        </w:rPr>
+        <w:t xml:space="preserve">Aun por </w:t>
+      </w:r>
+      <w:proofErr w:type="gramStart"/>
+      <w:r>
+        <w:rPr>
+          <w:b/>
+          <w:bCs/>
+        </w:rPr>
+        <w:t>resolver(</w:t>
+      </w:r>
+      <w:proofErr w:type="gramEnd"/>
+      <w:r>
+        <w:rPr>
+          <w:b/>
+          <w:bCs/>
+        </w:rPr>
+        <w:t xml:space="preserve">Juan </w:t>
+      </w:r>
+      <w:proofErr w:type="spellStart"/>
+      <w:r>
+        <w:rPr>
+          <w:b/>
+          <w:bCs/>
+        </w:rPr>
+        <w:t>Jose</w:t>
+      </w:r>
+      <w:proofErr w:type="spellEnd"/>
+      <w:r>
+        <w:rPr>
+          <w:b/>
+          <w:bCs/>
+        </w:rPr>
+        <w:t>)</w:t>
+      </w:r>
+    </w:p>
+    <w:p>
+      <w:r>
+        <w:t xml:space="preserve">Aún estamos pensando en cómo vamos a </w:t>
+      </w:r>
+      <w:proofErr w:type="gramStart"/>
+      <w:r>
+        <w:t>hacer  la</w:t>
+      </w:r>
+      <w:proofErr w:type="gramEnd"/>
+      <w:r>
+        <w:t xml:space="preserve"> lectura y escritura de archivos, porque los mensajes pueden incluir espacios y tener hasta 512 caracteres, medir la memoria de objetos que contienen arreglos dinámicos y contabilizar iteraciones de llamadas auxiliares requiere definir un criterio común y aplicarlo en toda la solución de nuestro </w:t>
+      </w:r>
+      <w:proofErr w:type="gramStart"/>
+      <w:r>
+        <w:t>código(</w:t>
+      </w:r>
+      <w:proofErr w:type="gramEnd"/>
+      <w:r>
+        <w:t xml:space="preserve">sabemos el uso de lectura y escritura sobre la implementación) pero con el uso de métodos de </w:t>
+      </w:r>
+      <w:proofErr w:type="spellStart"/>
+      <w:proofErr w:type="gramStart"/>
+      <w:r>
+        <w:t>cin</w:t>
+      </w:r>
+      <w:proofErr w:type="spellEnd"/>
+      <w:r>
+        <w:t>(</w:t>
+      </w:r>
+      <w:proofErr w:type="spellStart"/>
+      <w:r>
+        <w:t>cin.ignore</w:t>
+      </w:r>
+      <w:proofErr w:type="spellEnd"/>
+      <w:proofErr w:type="gramEnd"/>
+      <w:r>
+        <w:t xml:space="preserve">, </w:t>
+      </w:r>
+      <w:proofErr w:type="spellStart"/>
+      <w:proofErr w:type="gramStart"/>
+      <w:r>
+        <w:t>cin.getline</w:t>
+      </w:r>
+      <w:proofErr w:type="spellEnd"/>
+      <w:proofErr w:type="gramEnd"/>
+      <w:r>
+        <w:t xml:space="preserve"> entre otros). </w:t>
+      </w:r>
+    </w:p>
+    <w:p/>
+    <w:p>
+      <w:r>
+        <w:rPr>
+          <w:b/>
+          <w:bCs/>
+        </w:rPr>
+        <w:t xml:space="preserve">Trabajo para </w:t>
+      </w:r>
+      <w:proofErr w:type="gramStart"/>
+      <w:r>
+        <w:rPr>
+          <w:b/>
+          <w:bCs/>
+        </w:rPr>
+        <w:t>hacer(</w:t>
+      </w:r>
+      <w:proofErr w:type="gramEnd"/>
+      <w:r>
+        <w:rPr>
+          <w:b/>
+          <w:bCs/>
+        </w:rPr>
+        <w:t xml:space="preserve">Juan </w:t>
+      </w:r>
+      <w:proofErr w:type="spellStart"/>
+      <w:r>
+        <w:rPr>
+          <w:b/>
+          <w:bCs/>
+        </w:rPr>
+        <w:t>Jose</w:t>
+      </w:r>
+      <w:proofErr w:type="spellEnd"/>
+      <w:r>
+        <w:rPr>
+          <w:b/>
+          <w:bCs/>
+        </w:rPr>
+        <w:t>)</w:t>
+      </w:r>
+    </w:p>
+    <w:p/>
+    <w:p>
+      <w:r>
+        <w:t xml:space="preserve">Ejecución de pasó </w:t>
+      </w:r>
+      <w:proofErr w:type="spellStart"/>
+      <w:r>
+        <w:t>pasó</w:t>
+      </w:r>
+      <w:proofErr w:type="spellEnd"/>
+      <w:r>
+        <w:t xml:space="preserve"> del informe de nuestro equipo de trabajo completando el diagrama de clases agregando sus correspondientes atributos y métodos. También debemos elegir un formato de almacenamiento y crear la carga inicial de usuarios y relaciones implementando las funciones principales por partes iniciar la sesión, amistades, visitas de perfiles, sugerencias y mensajes. Pensamos implementar una medición para las iteraciones y memorias para tener un uso eficiente del </w:t>
+      </w:r>
+      <w:proofErr w:type="spellStart"/>
+      <w:r>
+        <w:t>codigo</w:t>
+      </w:r>
+      <w:proofErr w:type="spellEnd"/>
+      <w:r>
+        <w:t>. Y realizaremos pruebas con 1000 usuarios para revisar los resultados. </w:t>
       </w:r>
     </w:p>
     <w:p/>
@@ -1234,7 +1572,6 @@
   <w:style w:type="character" w:default="1" w:styleId="Fuentedeprrafopredeter">
     <w:name w:val="Default Paragraph Font"/>
     <w:uiPriority w:val="1"/>
-    <w:semiHidden/>
     <w:unhideWhenUsed/>
   </w:style>
   <w:style w:type="table" w:default="1" w:styleId="Tablanormal">

</xml_diff>

<commit_message>
Tercer_commit:todas las clases, complementacion de analisis y diagrama. Ademas de archivos de prueba
</commit_message>
<xml_diff>
--- a/Ude@Book/Informe Analisis Ude@Book.docx
+++ b/Ude@Book/Informe Analisis Ude@Book.docx
@@ -198,9 +198,6 @@
       </w:r>
     </w:p>
     <w:p>
-      <w:pPr>
-        <w:jc w:val="center"/>
-      </w:pPr>
       <w:r>
         <w:lastRenderedPageBreak/>
         <w:t>ANALISIS DEL PROBLEMA UDE@BOOK</w:t>
@@ -208,10 +205,7 @@
     </w:p>
     <w:p>
       <w:r>
-        <w:t xml:space="preserve">Sabemos </w:t>
-      </w:r>
-      <w:r>
-        <w:t xml:space="preserve">que </w:t>
+        <w:t xml:space="preserve">Sabemos que </w:t>
       </w:r>
       <w:proofErr w:type="spellStart"/>
       <w:r>
@@ -228,6 +222,347 @@
       <w:proofErr w:type="gramEnd"/>
       <w:r>
         <w:t xml:space="preserve"> necesita una interfaz gráfica ni almacenar las imágenes directamente: para mostrar una foto basta con presentar la ruta del archivo donde se encuentra guardada.</w:t>
+      </w:r>
+    </w:p>
+    <w:p>
+      <w:r>
+        <w:t>Lo principal para nosotros</w:t>
+      </w:r>
+    </w:p>
+    <w:p>
+      <w:r>
+        <w:t>Principalmente para nosotros es representar mediante clases los usuarios, álbumes, fotos, mensajes, fechas con estos podemos definir las relaciones que van a ver entre los antes mencionados y poder establecer una forma de cargar y actualizar los datos desde archivos permanentes como si fueran una base de datos y también como importante es como vamos a realizar el control de iteraciones y la memoria asociada a cada funcionalidad </w:t>
+      </w:r>
+    </w:p>
+    <w:p>
+      <w:r>
+        <w:t>Nuestro diseño de código</w:t>
+      </w:r>
+    </w:p>
+    <w:p>
+      <w:r>
+        <w:t xml:space="preserve">Nuestro código es dividir el programa en clases con responsabilidad a cada clase. La clase </w:t>
+      </w:r>
+      <w:proofErr w:type="spellStart"/>
+      <w:r>
+        <w:t>UdeABook</w:t>
+      </w:r>
+      <w:proofErr w:type="spellEnd"/>
+      <w:r>
+        <w:t xml:space="preserve"> funciona como coordinadora general; Usuario mantiene la información y relaciones de una persona; Álbum agrupa fotos; Foto y Mensaje representan contenidos; Fecha centraliza el manejo de fechas; y Medidor Recursos registra las métricas de ejecución. Esta separación ayuda a no concentrar toda la lógica en una sola clase o en el menú principal. Es lo que tenemos más superficialmente </w:t>
+      </w:r>
+    </w:p>
+    <w:p>
+      <w:r>
+        <w:t xml:space="preserve">Además de las clases mostradas inicialmente, la implementación final incluye Texto y </w:t>
+      </w:r>
+      <w:proofErr w:type="spellStart"/>
+      <w:r>
+        <w:t>ArregloDinamico</w:t>
+      </w:r>
+      <w:proofErr w:type="spellEnd"/>
+      <w:r>
+        <w:t xml:space="preserve">&lt;T&gt;. Texto reemplaza el uso de </w:t>
+      </w:r>
+      <w:proofErr w:type="spellStart"/>
+      <w:r>
+        <w:t>string</w:t>
+      </w:r>
+      <w:proofErr w:type="spellEnd"/>
+      <w:r>
+        <w:t xml:space="preserve"> y administra memoria dinámica para los caracteres. </w:t>
+      </w:r>
+      <w:proofErr w:type="spellStart"/>
+      <w:r>
+        <w:t>ArregloDinamico</w:t>
+      </w:r>
+      <w:proofErr w:type="spellEnd"/>
+      <w:r>
+        <w:t>&lt;T&gt; es una plantilla propia utilizada para almacenar diferentes tipos de elementos.</w:t>
+      </w:r>
+    </w:p>
+    <w:p>
+      <w:r>
+        <w:t>El diagrama muestra las clases principales y sus asociaciones. Al ser una versión resumida, presenta sobre todo las relaciones; en el diagrama completo conviene detallar también los atributos y las operaciones públicas de cada clase, para que coincidan con lo que finalmente se implemente.</w:t>
+      </w:r>
+    </w:p>
+    <w:p>
+      <w:proofErr w:type="spellStart"/>
+      <w:r>
+        <w:t>UdeABook</w:t>
+      </w:r>
+      <w:proofErr w:type="spellEnd"/>
+      <w:r>
+        <w:t xml:space="preserve"> administra a muchos usuarios y se relaciona con un medidor de recursos para registrar las </w:t>
+      </w:r>
+      <w:proofErr w:type="gramStart"/>
+      <w:r>
+        <w:t>medidas  de</w:t>
+      </w:r>
+      <w:proofErr w:type="gramEnd"/>
+      <w:r>
+        <w:t xml:space="preserve"> las </w:t>
+      </w:r>
+      <w:proofErr w:type="gramStart"/>
+      <w:r>
+        <w:t>operaciones  el</w:t>
+      </w:r>
+      <w:proofErr w:type="gramEnd"/>
+      <w:r>
+        <w:t xml:space="preserve"> Usuario puede llegar a tener cero o muchos álbumes y cada uno de estos pertenecen a un único usuario cabe recalcar que un álbum puede contener también cero o muchas fotos cada foto pertenece a un solo </w:t>
+      </w:r>
+      <w:proofErr w:type="spellStart"/>
+      <w:r>
+        <w:t>album</w:t>
+      </w:r>
+      <w:proofErr w:type="spellEnd"/>
+      <w:r>
+        <w:t>.</w:t>
+      </w:r>
+    </w:p>
+    <w:p>
+      <w:r>
+        <w:t xml:space="preserve">El Usuario el mismo puede presentar la amistad y las solicitudes y esto es importante para que el programa distinga las amistades confirmadas y las solicitudes que siguen pendientes, los usuarios pueden enviar y recibir </w:t>
+      </w:r>
+      <w:proofErr w:type="gramStart"/>
+      <w:r>
+        <w:t>mensajes  y</w:t>
+      </w:r>
+      <w:proofErr w:type="gramEnd"/>
+      <w:r>
+        <w:t xml:space="preserve"> estos mensajes deben tener un emisor, receptor y una fecha de envío. </w:t>
+      </w:r>
+    </w:p>
+    <w:p>
+      <w:r>
+        <w:lastRenderedPageBreak/>
+        <w:t xml:space="preserve">Las clases también implementan constructores de copia, destructores y operadores sobrecargados cuando administran memoria o necesitan comparar objetos. Se utilizan funciones amigas </w:t>
+      </w:r>
+      <w:proofErr w:type="spellStart"/>
+      <w:r>
+        <w:t>operator</w:t>
+      </w:r>
+      <w:proofErr w:type="spellEnd"/>
+      <w:r>
+        <w:t>&lt;&lt; para imprimir Fecha, Usuario y Texto directamente en un flujo de salida.</w:t>
+      </w:r>
+    </w:p>
+    <w:p>
+      <w:r>
+        <w:t>Y por último la clase fecha permite representar datos temporales que están relacionados al perfil, la captura de una foto y el envío de un mensaje. </w:t>
+      </w:r>
+    </w:p>
+    <w:p/>
+    <w:p>
+      <w:r>
+        <w:t>La información se leerá desde archivos al iniciar el programa y se cargará a estructuras en memoria dinámica. Las consultas y los cambios se harán sobre los datos en memoria; los archivos se usarán como almacenamiento permanente para cargar y guardar la información, no como una zona temporal para procesar los algoritmos.</w:t>
+      </w:r>
+    </w:p>
+    <w:p>
+      <w:r>
+        <w:t>La solución utiliza archivos de texto, con un registro por línea y campos separados por el carácter “|”. Este formato es sencillo de revisar y permite cargar y actualizar la información permanente. Los campos de texto no deben contener el carácter delimitador; la lectura se realiza mediante la clase Texto, carácter por carácter.</w:t>
+      </w:r>
+    </w:p>
+    <w:p>
+      <w:r>
+        <w:t>Las rutas absolutas de las fotos se guardan como texto; el programa no necesita cargar la imagen para mostrarla. Al visualizar una foto se muestra directamente la ruta almacenada en fotos.txt, de acuerdo con la estructura indicada en el enunciado.</w:t>
+      </w:r>
+    </w:p>
+    <w:p>
+      <w:r>
+        <w:t>Para seleccionar las fotos de perfil, cada amigo recibe un peso según los amigos en común: peso 1,0 si tiene 10 o menos, prioridad 2,5 veces mayor si tiene entre 11 y 20, y 3,5 veces mayor si supera 20. Se elige aleatoriamente según esos pesos y se retira cada seleccionado de la lista temporal, evitando repetirlo. La opción de actualización solo se habilita una vez por sesión y muestra otro conjunto distinto cuando existen suficientes amigos.</w:t>
+      </w:r>
+    </w:p>
+    <w:p>
+      <w:r>
+        <w:t>Al enviar una solicitud, el sistema busca al usuario indicado y verifica que exista, que no sea el mismo usuario, que no haya una amistad confirmada y que no exista una solicitud duplicada o pendiente en sentido contrario. Si las condiciones se cumplen, se registra la solicitud. Para aceptar una solicitud recibida, se selecciona de la lista y se registra la amistad en ambos sentidos; después se retira la solicitud pendiente.</w:t>
+      </w:r>
+    </w:p>
+    <w:p>
+      <w:r>
+        <w:t xml:space="preserve">Para poder visitar el perfil y poder recorrer álbumes primero se verifica que el perfil corresponde a un amigo. Luego se muestran solamente los álbumes públicos o configurados para amigos. Al escoger un álbum, el carrusel comienza en una foto y permite avanzar o retroceder circularmente: después de la última se vuelve a la primera, y antes de la primera se pasa a la última. La opción de </w:t>
+      </w:r>
+      <w:proofErr w:type="spellStart"/>
+      <w:r>
+        <w:t>like</w:t>
+      </w:r>
+      <w:proofErr w:type="spellEnd"/>
+      <w:r>
+        <w:t xml:space="preserve"> incrementa el contador si se da y lo decrementa si se quita, sin permitir que quede negativo.</w:t>
+      </w:r>
+    </w:p>
+    <w:p>
+      <w:r>
+        <w:lastRenderedPageBreak/>
+        <w:t>Para saber qué usuarios pueden llegar a ser sugerencias se calcula cuántos amigos tienen en común con el usuario activo. La matriz de amistades permite verificar si dos usuarios son amigos mediante una posición. Se recorren los amigos del usuario activo y se cuentan los usuarios que también aparecen como amigos de cada candidato. Las sugerencias se ordenan de mayor a menor cantidad de amigos en común.</w:t>
+      </w:r>
+    </w:p>
+    <w:p>
+      <w:r>
+        <w:t>Cómo se llevan a cabo los mensajes</w:t>
+      </w:r>
+    </w:p>
+    <w:p>
+      <w:r>
+        <w:t xml:space="preserve">Para que la persona pueda enviar un mensaje, primero, se comprueba que </w:t>
+      </w:r>
+      <w:proofErr w:type="spellStart"/>
+      <w:r>
+        <w:t>el</w:t>
+      </w:r>
+      <w:proofErr w:type="spellEnd"/>
+      <w:r>
+        <w:t xml:space="preserve"> sea amigo el que recibe, que el texto no vaya a estar vacío y que no supere los 512 caracteres debemos saber que el nuevo mensaje se va a registrar como emisor, receptor, fecha, estado inicial no leído. Para que el usuario pueda leer mensajes </w:t>
+      </w:r>
+      <w:proofErr w:type="gramStart"/>
+      <w:r>
+        <w:t>nuevos  debemos</w:t>
+      </w:r>
+      <w:proofErr w:type="gramEnd"/>
+      <w:r>
+        <w:t xml:space="preserve"> recorrer los mensajes recibidos y que se muestren solamente los no leídos ordenados por la última fecha de envío y después </w:t>
+      </w:r>
+      <w:proofErr w:type="spellStart"/>
+      <w:r>
+        <w:t>mostrarselos</w:t>
+      </w:r>
+      <w:proofErr w:type="spellEnd"/>
+      <w:r>
+        <w:t xml:space="preserve"> para marcarlos como leídos los al abrirse. Si se tiene una fecha ya con eso podemos saber si se quiere buscar mensaje en </w:t>
+      </w:r>
+      <w:proofErr w:type="spellStart"/>
+      <w:r>
+        <w:t>especifico</w:t>
+      </w:r>
+      <w:proofErr w:type="spellEnd"/>
+      <w:r>
+        <w:t xml:space="preserve"> o en rango de fechas.</w:t>
+      </w:r>
+    </w:p>
+    <w:p>
+      <w:r>
+        <w:t>¿Cómo sabremos cuántos recursos usa nuestro código? (</w:t>
+      </w:r>
+      <w:proofErr w:type="spellStart"/>
+      <w:r>
+        <w:t>Sebastian</w:t>
+      </w:r>
+      <w:proofErr w:type="spellEnd"/>
+      <w:r>
+        <w:t xml:space="preserve"> Muñoz)</w:t>
+      </w:r>
+    </w:p>
+    <w:p>
+      <w:r>
+        <w:t xml:space="preserve">Pensamos que para saber el gasto de recursos debemos tener en cuenta que en cada recorrido que podamos hacer en un arreglo y se haga cada comparación repetida o que se llaman a variables auxiliares que formen parte de una operación deben tener una forma de </w:t>
+      </w:r>
+      <w:proofErr w:type="gramStart"/>
+      <w:r>
+        <w:t>registro  al</w:t>
+      </w:r>
+      <w:proofErr w:type="gramEnd"/>
+      <w:r>
+        <w:t xml:space="preserve"> finalizar esta operación el número obtenido se muestra y después calculamos la memoria utilizada por los objetos los arreglos dinámicos y datos auxiliares.  </w:t>
+      </w:r>
+    </w:p>
+    <w:p>
+      <w:r>
+        <w:t xml:space="preserve">Cómo implementaremos la eficiencia (Por </w:t>
+      </w:r>
+      <w:proofErr w:type="spellStart"/>
+      <w:r>
+        <w:t>Sebastian</w:t>
+      </w:r>
+      <w:proofErr w:type="spellEnd"/>
+      <w:r>
+        <w:t xml:space="preserve"> Muñoz)</w:t>
+      </w:r>
+    </w:p>
+    <w:p>
+      <w:r>
+        <w:t xml:space="preserve">Para este código debemos priorizar los arreglos dinámicos y fortalecer las estructuras para conservar y controlar el uso de la memoria. Como el enunciado no permite utilizar herencia, cada clase se encarga de sus propios datos y operaciones. </w:t>
+      </w:r>
+      <w:proofErr w:type="spellStart"/>
+      <w:r>
+        <w:t>ArregloDinamico</w:t>
+      </w:r>
+      <w:proofErr w:type="spellEnd"/>
+      <w:r>
+        <w:t>&lt;T&gt; aumenta su capacidad cuando se llena y permite reutilizar una misma estructura para usuarios, álbumes, fotos y mensajes.</w:t>
+      </w:r>
+    </w:p>
+    <w:p>
+      <w:r>
+        <w:t xml:space="preserve">Se tiene en cuenta que en nuestro código la clase fecha centraliza la comparación cronológica para que no se repetían la misma lógica en mensajes y usuarios y en el uso de constructores se deben de hacer de una forma </w:t>
+      </w:r>
+      <w:proofErr w:type="gramStart"/>
+      <w:r>
+        <w:t>adecuada  cuando</w:t>
+      </w:r>
+      <w:proofErr w:type="gramEnd"/>
+      <w:r>
+        <w:t xml:space="preserve"> sea uno de copia que una clase pueda gestionar la memoria dinámica y el uso de </w:t>
+      </w:r>
+      <w:proofErr w:type="spellStart"/>
+      <w:r>
+        <w:t>getters</w:t>
+      </w:r>
+      <w:proofErr w:type="spellEnd"/>
+      <w:r>
+        <w:t xml:space="preserve"> y </w:t>
+      </w:r>
+      <w:proofErr w:type="spellStart"/>
+      <w:r>
+        <w:t>setters</w:t>
+      </w:r>
+      <w:proofErr w:type="spellEnd"/>
+      <w:r>
+        <w:t xml:space="preserve"> cuando sean necesarios.</w:t>
+      </w:r>
+    </w:p>
+    <w:p>
+      <w:r>
+        <w:t>Aspectos resueltos en la implementación (Juan José)</w:t>
+      </w:r>
+    </w:p>
+    <w:p>
+      <w:r>
+        <w:t xml:space="preserve">La lectura y escritura de archivos se resolvió mediante la clase Texto. Esta clase lee los campos carácter por carácter usando los separadores y permite conservar los espacios de los mensajes. El texto de cada mensaje se </w:t>
+      </w:r>
+      <w:proofErr w:type="spellStart"/>
+      <w:r>
+        <w:t>valida</w:t>
+      </w:r>
+      <w:proofErr w:type="spellEnd"/>
+      <w:r>
+        <w:t xml:space="preserve"> para que tenga entre 1 y 512 caracteres. La memoria de los objetos y arreglos dinámicos se calcula mediante métodos </w:t>
+      </w:r>
+      <w:proofErr w:type="spellStart"/>
+      <w:r>
+        <w:lastRenderedPageBreak/>
+        <w:t>calcularMemoria</w:t>
+      </w:r>
+      <w:proofErr w:type="spellEnd"/>
+      <w:r>
+        <w:t xml:space="preserve">, mientras que las iteraciones de los algoritmos se registran con </w:t>
+      </w:r>
+      <w:proofErr w:type="spellStart"/>
+      <w:r>
+        <w:t>MedidorRecursos</w:t>
+      </w:r>
+      <w:proofErr w:type="spellEnd"/>
+      <w:r>
+        <w:t>.</w:t>
+      </w:r>
+    </w:p>
+    <w:p>
+      <w:r>
+        <w:t>Trabajo realizado (Juan José)</w:t>
+      </w:r>
+    </w:p>
+    <w:p>
+      <w:r>
+        <w:t>Como evolución del trabajo, completamos el diagrama de clases agregando sus atributos y métodos. Definimos el formato de almacenamiento y creamos la carga inicial de usuarios y relaciones. Después implementamos por partes el inicio de sesión, las amistades, las visitas de perfiles, las sugerencias y los mensajes. También implementamos la medición de iteraciones y memoria y realizamos pruebas con 1000 usuarios para revisar los resultados.</w:t>
       </w:r>
     </w:p>
     <w:p>
@@ -236,12 +571,20 @@
           <w:b/>
           <w:bCs/>
         </w:rPr>
-        <w:t>Lo principal para nosotros.</w:t>
-      </w:r>
-    </w:p>
-    <w:p>
-      <w:r>
-        <w:t>Principalmente para nosotros es representar mediante clases los usuarios, álbumes, fotos, mensajes, fechas con estos podemos definir las relaciones que van a ver entre los antes mencionados y poder establecer una forma de cargar y actualizar los datos desde archivos permanentes como si fueran una base de datos y también como importante es como vamos a realizar el control de iteraciones y la memoria asociada a cada funcionalidad </w:t>
+        <w:t>Formato de archivos utilizado</w:t>
+      </w:r>
+    </w:p>
+    <w:p>
+      <w:r>
+        <w:t xml:space="preserve">La información se organiza en los archivos usuarios.txt, amistades.txt, solicitudes.txt, albumes.txt, fotos.txt y mensajes.txt. Cada línea representa un registro y los campos se separan mediante “|”. usuarios.txt contiene los datos personales; albumes.txt contiene el dueño, nombre, ruta y privacidad; fotos.txt contiene el dueño, álbum, ruta, tamaño, fecha y </w:t>
+      </w:r>
+      <w:proofErr w:type="spellStart"/>
+      <w:r>
+        <w:t>likes</w:t>
+      </w:r>
+      <w:proofErr w:type="spellEnd"/>
+      <w:r>
+        <w:t>; amistades.txt y solicitudes.txt contienen los identificadores relacionados. Los mensajes contienen emisor, receptor, texto, fecha y estado leído. Los datos se cargan al iniciar y los cambios permitidos se guardan al finalizar.</w:t>
       </w:r>
     </w:p>
     <w:p>
@@ -250,53 +593,50 @@
           <w:b/>
           <w:bCs/>
         </w:rPr>
-        <w:t xml:space="preserve">Nuestro diseño de </w:t>
-      </w:r>
-      <w:proofErr w:type="spellStart"/>
-      <w:r>
-        <w:rPr>
-          <w:b/>
-          <w:bCs/>
-        </w:rPr>
-        <w:t>codigo</w:t>
-      </w:r>
-      <w:proofErr w:type="spellEnd"/>
-      <w:r>
-        <w:rPr>
-          <w:b/>
-          <w:bCs/>
-        </w:rPr>
-        <w:t> </w:t>
-      </w:r>
-    </w:p>
-    <w:p>
-      <w:r>
-        <w:t xml:space="preserve">Nuestro código es dividir el programa en clases con responsabilidad a cada clase. La clase </w:t>
-      </w:r>
-      <w:proofErr w:type="spellStart"/>
-      <w:r>
-        <w:t>UdeABook</w:t>
-      </w:r>
-      <w:proofErr w:type="spellEnd"/>
-      <w:r>
-        <w:t xml:space="preserve"> funciona como coordinadora general; Usuario mantiene la información y relaciones de una persona; Álbum agrupa fotos; Foto y Mensaje representan contenidos; Fecha centraliza el manejo de fechas; y Medidor Recursos registra las métricas de ejecución. Esta separación ayuda a no concentrar toda la lógica en una sola clase o en el menú principal. Es lo que tenemos más superficialmente </w:t>
-      </w:r>
-    </w:p>
-    <w:p>
-      <w:pPr>
-        <w:rPr>
-          <w:noProof/>
-        </w:rPr>
-      </w:pPr>
-      <w:r>
-        <w:rPr>
-          <w:noProof/>
-        </w:rPr>
+        <w:t>Estructuras propias y modularidad</w:t>
+      </w:r>
+    </w:p>
+    <w:p>
+      <w:r>
+        <w:t xml:space="preserve">La solución no utiliza contenedores de la STL para las estructuras principales. </w:t>
+      </w:r>
+      <w:proofErr w:type="spellStart"/>
+      <w:r>
+        <w:t>ArregloDinamico</w:t>
+      </w:r>
+      <w:proofErr w:type="spellEnd"/>
+      <w:r>
+        <w:t xml:space="preserve">&lt;T&gt; administra memoria dinámica y permanece en su archivo de cabecera porque es una plantilla. Texto sí está separado modularmente en </w:t>
+      </w:r>
+      <w:proofErr w:type="spellStart"/>
+      <w:r>
+        <w:t>Texto.h</w:t>
+      </w:r>
+      <w:proofErr w:type="spellEnd"/>
+      <w:r>
+        <w:t xml:space="preserve"> y Texto.cpp porque es una clase normal. La matriz </w:t>
+      </w:r>
+      <w:proofErr w:type="spellStart"/>
+      <w:r>
+        <w:t>bool</w:t>
+      </w:r>
+      <w:proofErr w:type="spellEnd"/>
+      <w:r>
+        <w:t>** representa la relación de amistad y permite calcular amigos en común. Para una cantidad mucho mayor de usuarios se podría reemplazar por listas de adyacencia, ya que la matriz utiliza O(n²) memoria.</w:t>
+      </w:r>
+    </w:p>
+    <w:p>
+      <w:r>
+        <w:t>Diagrama de clases resumido actualizado</w:t>
+      </w:r>
+    </w:p>
+    <w:p>
+      <w:r>
         <w:drawing>
-          <wp:inline distT="0" distB="0" distL="0" distR="0" wp14:anchorId="22B28D4D" wp14:editId="3FBF83CB">
-            <wp:extent cx="5612130" cy="2322195"/>
-            <wp:effectExtent l="0" t="0" r="7620" b="1905"/>
-            <wp:docPr id="48673865" name="Imagen 1"/>
+          <wp:inline distT="0" distB="0" distL="0" distR="0" wp14:anchorId="2B1BE6CB" wp14:editId="12D98844">
+            <wp:extent cx="5612130" cy="1903730"/>
+            <wp:effectExtent l="0" t="0" r="7620" b="1270"/>
+            <wp:docPr id="961459219" name="Imagen 3"/>
             <wp:cNvGraphicFramePr>
               <a:graphicFrameLocks xmlns:a="http://schemas.openxmlformats.org/drawingml/2006/main" noChangeAspect="1"/>
             </wp:cNvGraphicFramePr>
@@ -304,13 +644,13 @@
               <a:graphicData uri="http://schemas.openxmlformats.org/drawingml/2006/picture">
                 <pic:pic xmlns:pic="http://schemas.openxmlformats.org/drawingml/2006/picture">
                   <pic:nvPicPr>
-                    <pic:cNvPr id="0" name="Picture 1"/>
+                    <pic:cNvPr id="0" name="Picture 8"/>
                     <pic:cNvPicPr>
                       <a:picLocks noChangeAspect="1" noChangeArrowheads="1"/>
                     </pic:cNvPicPr>
                   </pic:nvPicPr>
                   <pic:blipFill>
-                    <a:blip r:embed="rId5" cstate="print">
+                    <a:blip r:embed="rId5">
                       <a:extLst>
                         <a:ext uri="{28A0092B-C50C-407E-A947-70E740481C1C}">
                           <a14:useLocalDpi xmlns:a14="http://schemas.microsoft.com/office/drawing/2010/main" val="0"/>
@@ -325,7 +665,7 @@
                   <pic:spPr bwMode="auto">
                     <a:xfrm>
                       <a:off x="0" y="0"/>
-                      <a:ext cx="5612130" cy="2322195"/>
+                      <a:ext cx="5612130" cy="1903730"/>
                     </a:xfrm>
                     <a:prstGeom prst="rect">
                       <a:avLst/>
@@ -342,468 +682,6 @@
         </w:drawing>
       </w:r>
     </w:p>
-    <w:p/>
-    <w:p>
-      <w:r>
-        <w:t>El diagrama muestra las clases principales y sus asociaciones. Al ser una versión resumida, presenta sobre todo las relaciones; en el diagrama completo conviene detallar también los atributos y las operaciones públicas de cada clase, para que coincidan con lo que finalmente se implemente.</w:t>
-      </w:r>
-    </w:p>
-    <w:p>
-      <w:proofErr w:type="spellStart"/>
-      <w:r>
-        <w:lastRenderedPageBreak/>
-        <w:t>UdeABook</w:t>
-      </w:r>
-      <w:proofErr w:type="spellEnd"/>
-      <w:r>
-        <w:t xml:space="preserve"> administra a muchos usuarios y se relaciona con un medidor de recursos para registrar las </w:t>
-      </w:r>
-      <w:proofErr w:type="gramStart"/>
-      <w:r>
-        <w:t>medidas  de</w:t>
-      </w:r>
-      <w:proofErr w:type="gramEnd"/>
-      <w:r>
-        <w:t xml:space="preserve"> las </w:t>
-      </w:r>
-      <w:proofErr w:type="gramStart"/>
-      <w:r>
-        <w:t>operaciones  el</w:t>
-      </w:r>
-      <w:proofErr w:type="gramEnd"/>
-      <w:r>
-        <w:t xml:space="preserve"> Usuario puede llegar a tener cero o muchos álbumes y cada uno de estos pertenecen a un único usuario cabe recalcar que un álbum puede contener también cero o muchas fotos cada foto pertenece a un solo </w:t>
-      </w:r>
-      <w:proofErr w:type="spellStart"/>
-      <w:r>
-        <w:t>album</w:t>
-      </w:r>
-      <w:proofErr w:type="spellEnd"/>
-      <w:r>
-        <w:t>.</w:t>
-      </w:r>
-    </w:p>
-    <w:p>
-      <w:r>
-        <w:t xml:space="preserve">El Usuario el mismo puede presentar la amistad y las solicitudes y esto es importante para que el programa distinga las amistades confirmadas y las solicitudes que siguen pendientes, los usuarios pueden enviar y recibir </w:t>
-      </w:r>
-      <w:proofErr w:type="gramStart"/>
-      <w:r>
-        <w:t>mensajes  y</w:t>
-      </w:r>
-      <w:proofErr w:type="gramEnd"/>
-      <w:r>
-        <w:t xml:space="preserve"> estos mensajes deben tener un emisor, receptor y una fecha de envío. </w:t>
-      </w:r>
-    </w:p>
-    <w:p>
-      <w:r>
-        <w:t>Y por último la clase fecha permite representar datos temporales que están relacionados al perfil, la captura de una foto y el envío de un mensaje. </w:t>
-      </w:r>
-    </w:p>
-    <w:p>
-      <w:r>
-        <w:br/>
-      </w:r>
-    </w:p>
-    <w:p>
-      <w:r>
-        <w:t>La información se leerá desde archivos al iniciar el programa y se cargará a estructuras en memoria dinámica. Las consultas y los cambios se harán sobre los datos en memoria; los archivos se usarán como almacenamiento permanente para cargar y guardar la información, no como una zona temporal para procesar los algoritmos.</w:t>
-      </w:r>
-    </w:p>
-    <w:p>
-      <w:r>
-        <w:t>Como propuesta inicial, los archivos pueden ser de texto, con un registro por línea y campos separados por el carácter “|”. Este formato es sencillo de revisar mientras se aprende C++, pero debe definirse cómo se guardan los caracteres delimitadores que aparezcan dentro del texto de un mensaje.</w:t>
-      </w:r>
-    </w:p>
-    <w:p>
-      <w:r>
-        <w:t>Las rutas de las fotos se guardan como texto; el programa no necesita cargar la imagen para mostrarla. La ruta de almacenamiento completa se obtiene a partir de los datos guardados, de acuerdo con la estructura indicada en el enunciado.</w:t>
-      </w:r>
-    </w:p>
-    <w:p>
-      <w:r>
-        <w:t>Para seleccionar las fotos de perfil, cada amigo recibe un peso según los amigos en común: peso base si tiene 10 o menos, prioridad 2,5 veces mayor si tiene entre 11 y 20, y 3,5 veces mayor si supera 20. Para evitar trabajar con decimales se pueden usar pesos proporcionales 2, 5 y 7. Se elige aleatoriamente según esos pesos y se retira cada seleccionado de la lista temporal, evitando repetirlo. La opción de actualización solo se habilita una vez y debe mostrar otro conjunto distinto cuando existan suficientes amigos.</w:t>
-      </w:r>
-    </w:p>
-    <w:p>
-      <w:r>
-        <w:t>Al enviar una solicitud, el sistema busca al usuario indicado y verifica que exista, que no sea el mismo usuario, que no haya una amistad confirmada y que no exista una solicitud duplicada o pendiente en sentido contrario. Si las condiciones se cumplen, se registra la solicitud. Para aceptar una solicitud recibida, se selecciona de la lista y se registra la amistad en ambos sentidos; después se retira la solicitud pendiente.</w:t>
-      </w:r>
-    </w:p>
-    <w:p>
-      <w:r>
-        <w:lastRenderedPageBreak/>
-        <w:t xml:space="preserve">Para poder visitar el perfil y poder recorrer álbumes primero se verifica que el perfil corresponde a un amigo. Luego se muestran solamente los álbumes públicos o configurados para amigos. Al escoger un álbum, el carrusel comienza en una foto y permite avanzar o retroceder circularmente: después de la última se vuelve a la primera, y antes de la primera se pasa a la última. La opción de </w:t>
-      </w:r>
-      <w:proofErr w:type="spellStart"/>
-      <w:r>
-        <w:t>like</w:t>
-      </w:r>
-      <w:proofErr w:type="spellEnd"/>
-      <w:r>
-        <w:t xml:space="preserve"> incrementa el contador si se da y lo decrementa si se quita, sin permitir que quede negativo.</w:t>
-      </w:r>
-    </w:p>
-    <w:p>
-      <w:r>
-        <w:t xml:space="preserve">Para saber qué usuarios pueden llegar a hacer conocidos se puede calcular cuántos amigos se puede tener en común una forma de representar las amistades una comparación de los </w:t>
-      </w:r>
-      <w:proofErr w:type="gramStart"/>
-      <w:r>
-        <w:t>amigos  y</w:t>
-      </w:r>
-      <w:proofErr w:type="gramEnd"/>
-      <w:r>
-        <w:t xml:space="preserve"> que si una posición indica que dos usuarios son amigos o no. se recorre los amigos de los dos y se verifica cuales también son amigos del usuario de la sugerencia.</w:t>
-      </w:r>
-    </w:p>
-    <w:p/>
-    <w:p>
-      <w:r>
-        <w:rPr>
-          <w:b/>
-          <w:bCs/>
-        </w:rPr>
-        <w:t>Como se llevan a cabo los mensajes</w:t>
-      </w:r>
-    </w:p>
-    <w:p>
-      <w:r>
-        <w:t xml:space="preserve">Para que la persona pueda enviar un mensaje, primero, se comprueba que </w:t>
-      </w:r>
-      <w:proofErr w:type="spellStart"/>
-      <w:r>
-        <w:t>el</w:t>
-      </w:r>
-      <w:proofErr w:type="spellEnd"/>
-      <w:r>
-        <w:t xml:space="preserve"> sea amigo el que recibe, que el texto no vaya a estar vacío y que no supere los 512 caracteres debemos saber que el nuevo mensaje se va a registrar como emisor, receptor, fecha, estado inicial no leído. Para que el usuario pueda leer mensajes </w:t>
-      </w:r>
-      <w:proofErr w:type="gramStart"/>
-      <w:r>
-        <w:t>nuevos  debemos</w:t>
-      </w:r>
-      <w:proofErr w:type="gramEnd"/>
-      <w:r>
-        <w:t xml:space="preserve"> recorrer los mensajes recibidos y que se muestren solamente los no leídos ordenados por la última fecha de envío y después </w:t>
-      </w:r>
-      <w:proofErr w:type="spellStart"/>
-      <w:r>
-        <w:t>mostrarselos</w:t>
-      </w:r>
-      <w:proofErr w:type="spellEnd"/>
-      <w:r>
-        <w:t xml:space="preserve"> para marcarlos como leídos los al abrirse. Si se tiene una fecha ya con eso podemos saber si se quiere buscar mensaje en </w:t>
-      </w:r>
-      <w:proofErr w:type="spellStart"/>
-      <w:r>
-        <w:t>especifico</w:t>
-      </w:r>
-      <w:proofErr w:type="spellEnd"/>
-      <w:r>
-        <w:t xml:space="preserve"> o en rango de fechas.</w:t>
-      </w:r>
-    </w:p>
-    <w:p/>
-    <w:p>
-      <w:r>
-        <w:rPr>
-          <w:b/>
-          <w:bCs/>
-        </w:rPr>
-        <w:t xml:space="preserve">¿Cómo sabremos cuantos recursos usa nuestro </w:t>
-      </w:r>
-      <w:proofErr w:type="gramStart"/>
-      <w:r>
-        <w:rPr>
-          <w:b/>
-          <w:bCs/>
-        </w:rPr>
-        <w:t>código?(</w:t>
-      </w:r>
-      <w:proofErr w:type="spellStart"/>
-      <w:proofErr w:type="gramEnd"/>
-      <w:r>
-        <w:rPr>
-          <w:b/>
-          <w:bCs/>
-        </w:rPr>
-        <w:t>Sebastian</w:t>
-      </w:r>
-      <w:proofErr w:type="spellEnd"/>
-      <w:r>
-        <w:rPr>
-          <w:b/>
-          <w:bCs/>
-        </w:rPr>
-        <w:t xml:space="preserve"> Muñoz)</w:t>
-      </w:r>
-    </w:p>
-    <w:p/>
-    <w:p>
-      <w:r>
-        <w:t xml:space="preserve">Pensamos que para saber el gasto de recursos debemos tener en cuenta que en cada recorrido que podamos hacer en un arreglo y se haga cada comparación repetida o que se llaman a variables auxiliares que formen parte de una operación deben tener una forma de </w:t>
-      </w:r>
-      <w:proofErr w:type="gramStart"/>
-      <w:r>
-        <w:t>registro  al</w:t>
-      </w:r>
-      <w:proofErr w:type="gramEnd"/>
-      <w:r>
-        <w:t xml:space="preserve"> finalizar esta operación el número obtenido se muestra y después calculamos la memoria utilizada por los objetos los arreglos dinámicos y datos auxiliares.  </w:t>
-      </w:r>
-    </w:p>
-    <w:p/>
-    <w:p>
-      <w:r>
-        <w:rPr>
-          <w:b/>
-          <w:bCs/>
-        </w:rPr>
-        <w:t>Como</w:t>
-      </w:r>
-      <w:r>
-        <w:t xml:space="preserve"> </w:t>
-      </w:r>
-      <w:r>
-        <w:rPr>
-          <w:b/>
-          <w:bCs/>
-        </w:rPr>
-        <w:t>implementaremos</w:t>
-      </w:r>
-      <w:r>
-        <w:t xml:space="preserve"> </w:t>
-      </w:r>
-      <w:r>
-        <w:rPr>
-          <w:b/>
-          <w:bCs/>
-        </w:rPr>
-        <w:t>Eficiencia</w:t>
-      </w:r>
-      <w:r>
-        <w:t xml:space="preserve">  </w:t>
-      </w:r>
-      <w:proofErr w:type="gramStart"/>
-      <w:r>
-        <w:t xml:space="preserve">   (</w:t>
-      </w:r>
-      <w:proofErr w:type="gramEnd"/>
-      <w:r>
-        <w:t xml:space="preserve">Por </w:t>
-      </w:r>
-      <w:proofErr w:type="spellStart"/>
-      <w:r>
-        <w:t>Sebastian</w:t>
-      </w:r>
-      <w:proofErr w:type="spellEnd"/>
-      <w:r>
-        <w:t xml:space="preserve"> Muñoz)</w:t>
-      </w:r>
-    </w:p>
-    <w:p>
-      <w:r>
-        <w:t xml:space="preserve">Para este código debemos priorizar siempre y principalmente los arreglos dinámicos y debemos fortalecer las estructuras para conversar y tener un control del uso de </w:t>
-      </w:r>
-      <w:proofErr w:type="spellStart"/>
-      <w:proofErr w:type="gramStart"/>
-      <w:r>
-        <w:t>memoria.Sabemos</w:t>
-      </w:r>
-      <w:proofErr w:type="spellEnd"/>
-      <w:proofErr w:type="gramEnd"/>
-      <w:r>
-        <w:t xml:space="preserve"> que el uso de herencia aun no la utilizamos entonces cada clase debe encargarse de sus propios datos y poder hacer operaciones. </w:t>
-      </w:r>
-    </w:p>
-    <w:p>
-      <w:r>
-        <w:lastRenderedPageBreak/>
-        <w:t xml:space="preserve">Se tiene en cuenta que en nuestro código la clase fecha centraliza la comparación cronológica para que no se repetían la misma lógica en mensajes y usuarios y en el uso de constructores se deben de hacer de una forma </w:t>
-      </w:r>
-      <w:proofErr w:type="gramStart"/>
-      <w:r>
-        <w:t>adecuada  cuando</w:t>
-      </w:r>
-      <w:proofErr w:type="gramEnd"/>
-      <w:r>
-        <w:t xml:space="preserve"> sea uno de copia que una clase pueda gestionar la memoria dinámica y el uso de </w:t>
-      </w:r>
-      <w:proofErr w:type="spellStart"/>
-      <w:r>
-        <w:t>getters</w:t>
-      </w:r>
-      <w:proofErr w:type="spellEnd"/>
-      <w:r>
-        <w:t xml:space="preserve"> y </w:t>
-      </w:r>
-      <w:proofErr w:type="spellStart"/>
-      <w:r>
-        <w:t>setters</w:t>
-      </w:r>
-      <w:proofErr w:type="spellEnd"/>
-      <w:r>
-        <w:t xml:space="preserve"> cuando sean necesarios.</w:t>
-      </w:r>
-    </w:p>
-    <w:p/>
-    <w:p>
-      <w:r>
-        <w:rPr>
-          <w:b/>
-          <w:bCs/>
-        </w:rPr>
-        <w:t xml:space="preserve">Aun por </w:t>
-      </w:r>
-      <w:proofErr w:type="gramStart"/>
-      <w:r>
-        <w:rPr>
-          <w:b/>
-          <w:bCs/>
-        </w:rPr>
-        <w:t>resolver(</w:t>
-      </w:r>
-      <w:proofErr w:type="gramEnd"/>
-      <w:r>
-        <w:rPr>
-          <w:b/>
-          <w:bCs/>
-        </w:rPr>
-        <w:t xml:space="preserve">Juan </w:t>
-      </w:r>
-      <w:proofErr w:type="spellStart"/>
-      <w:r>
-        <w:rPr>
-          <w:b/>
-          <w:bCs/>
-        </w:rPr>
-        <w:t>Jose</w:t>
-      </w:r>
-      <w:proofErr w:type="spellEnd"/>
-      <w:r>
-        <w:rPr>
-          <w:b/>
-          <w:bCs/>
-        </w:rPr>
-        <w:t>)</w:t>
-      </w:r>
-    </w:p>
-    <w:p>
-      <w:r>
-        <w:t xml:space="preserve">Aún estamos pensando en cómo vamos a </w:t>
-      </w:r>
-      <w:proofErr w:type="gramStart"/>
-      <w:r>
-        <w:t>hacer  la</w:t>
-      </w:r>
-      <w:proofErr w:type="gramEnd"/>
-      <w:r>
-        <w:t xml:space="preserve"> lectura y escritura de archivos, porque los mensajes pueden incluir espacios y tener hasta 512 caracteres, medir la memoria de objetos que contienen arreglos dinámicos y contabilizar iteraciones de llamadas auxiliares requiere definir un criterio común y aplicarlo en toda la solución de nuestro </w:t>
-      </w:r>
-      <w:proofErr w:type="gramStart"/>
-      <w:r>
-        <w:t>código(</w:t>
-      </w:r>
-      <w:proofErr w:type="gramEnd"/>
-      <w:r>
-        <w:t xml:space="preserve">sabemos el uso de lectura y escritura sobre la implementación) pero con el uso de métodos de </w:t>
-      </w:r>
-      <w:proofErr w:type="spellStart"/>
-      <w:proofErr w:type="gramStart"/>
-      <w:r>
-        <w:t>cin</w:t>
-      </w:r>
-      <w:proofErr w:type="spellEnd"/>
-      <w:r>
-        <w:t>(</w:t>
-      </w:r>
-      <w:proofErr w:type="spellStart"/>
-      <w:r>
-        <w:t>cin.ignore</w:t>
-      </w:r>
-      <w:proofErr w:type="spellEnd"/>
-      <w:proofErr w:type="gramEnd"/>
-      <w:r>
-        <w:t xml:space="preserve">, </w:t>
-      </w:r>
-      <w:proofErr w:type="spellStart"/>
-      <w:proofErr w:type="gramStart"/>
-      <w:r>
-        <w:t>cin.getline</w:t>
-      </w:r>
-      <w:proofErr w:type="spellEnd"/>
-      <w:proofErr w:type="gramEnd"/>
-      <w:r>
-        <w:t xml:space="preserve"> entre otros). </w:t>
-      </w:r>
-    </w:p>
-    <w:p/>
-    <w:p>
-      <w:r>
-        <w:rPr>
-          <w:b/>
-          <w:bCs/>
-        </w:rPr>
-        <w:t xml:space="preserve">Trabajo para </w:t>
-      </w:r>
-      <w:proofErr w:type="gramStart"/>
-      <w:r>
-        <w:rPr>
-          <w:b/>
-          <w:bCs/>
-        </w:rPr>
-        <w:t>hacer(</w:t>
-      </w:r>
-      <w:proofErr w:type="gramEnd"/>
-      <w:r>
-        <w:rPr>
-          <w:b/>
-          <w:bCs/>
-        </w:rPr>
-        <w:t xml:space="preserve">Juan </w:t>
-      </w:r>
-      <w:proofErr w:type="spellStart"/>
-      <w:r>
-        <w:rPr>
-          <w:b/>
-          <w:bCs/>
-        </w:rPr>
-        <w:t>Jose</w:t>
-      </w:r>
-      <w:proofErr w:type="spellEnd"/>
-      <w:r>
-        <w:rPr>
-          <w:b/>
-          <w:bCs/>
-        </w:rPr>
-        <w:t>)</w:t>
-      </w:r>
-    </w:p>
-    <w:p/>
-    <w:p>
-      <w:r>
-        <w:t xml:space="preserve">Ejecución de pasó </w:t>
-      </w:r>
-      <w:proofErr w:type="spellStart"/>
-      <w:r>
-        <w:t>pasó</w:t>
-      </w:r>
-      <w:proofErr w:type="spellEnd"/>
-      <w:r>
-        <w:t xml:space="preserve"> del informe de nuestro equipo de trabajo completando el diagrama de clases agregando sus correspondientes atributos y métodos. También debemos elegir un formato de almacenamiento y crear la carga inicial de usuarios y relaciones implementando las funciones principales por partes iniciar la sesión, amistades, visitas de perfiles, sugerencias y mensajes. Pensamos implementar una medición para las iteraciones y memorias para tener un uso eficiente del </w:t>
-      </w:r>
-      <w:proofErr w:type="spellStart"/>
-      <w:r>
-        <w:t>codigo</w:t>
-      </w:r>
-      <w:proofErr w:type="spellEnd"/>
-      <w:r>
-        <w:t>. Y realizaremos pruebas con 1000 usuarios para revisar los resultados. </w:t>
-      </w:r>
-    </w:p>
-    <w:p/>
     <w:sectPr>
       <w:pgSz w:w="12240" w:h="15840"/>
       <w:pgMar w:top="1417" w:right="1701" w:bottom="1417" w:left="1701" w:header="708" w:footer="708" w:gutter="0"/>

</xml_diff>